<commit_message>
Manuscript v4: continuïteit doorgevoerd en ontknoping herschreven
Publicatiedeadline in plaats van vernis, schacht met krassen, Arnold de Wit
als stem in de grot, Herengracht-confrontatie herschreven, twee
afwikkelhoofdstukken geschrapt, inhoudsopgave bijgewerkt. Story bible en
wijzigingslog bijgewerkt.

Co-Authored-By: Claude Opus 5.5 <noreply@anthropic.com>
Claude-Session: https://claude.ai/code/session_01NePC8cCoeqbRjNexdJRDxm
</commit_message>
<xml_diff>
--- a/story-bible/Story_Bible_De_Schaduw_van_de_Nachtwacht.docx
+++ b/story-bible/Story_Bible_De_Schaduw_van_de_Nachtwacht.docx
@@ -87,7 +87,7 @@
         <w:pStyle w:val="BodyText"/>
       </w:pPr>
       <w:r>
-        <w:t xml:space="preserve">Laatste update: 12 oktober 2026. Proloog herschreven (manuscript v3).</w:t>
+        <w:t xml:space="preserve">Laatste update: 12 oktober 2026. Manuscript v4: proloog herschreven, continuïteitslijst doorgevoerd, ontknoping herschreven.</w:t>
       </w:r>
     </w:p>
     <w:bookmarkEnd w:id="20"/>
@@ -764,25 +764,7 @@
         <w:pStyle w:val="Compact"/>
       </w:pPr>
       <w:r>
-        <w:t xml:space="preserve">Arnold opende het laatje zelf; de zin</w:t>
-      </w:r>
-      <w:r>
-        <w:t xml:space="preserve"> </w:t>
-      </w:r>
-      <w:r>
-        <w:t xml:space="preserve">“</w:t>
-      </w:r>
-      <w:r>
-        <w:t xml:space="preserve">Ik heb het nooit kunnen openen</w:t>
-      </w:r>
-      <w:r>
-        <w:t xml:space="preserve">”</w:t>
-      </w:r>
-      <w:r>
-        <w:t xml:space="preserve"> </w:t>
-      </w:r>
-      <w:r>
-        <w:t xml:space="preserve">vervalt.</w:t>
+        <w:t xml:space="preserve">Arnold opent het laatje zelf, waar Sophie bij is. Sophie neemt alleen de kaart mee; de brieven gaan later via Isaak naar Marieke.</w:t>
       </w:r>
     </w:p>
     <w:p>
@@ -1418,7 +1400,7 @@
         <w:pStyle w:val="FirstParagraph"/>
       </w:pPr>
       <w:r>
-        <w:t xml:space="preserve">Status: open, tenzij anders vermeld.</w:t>
+        <w:t xml:space="preserve">Status: alle punten doorgevoerd in manuscript v4, behalve waar anders vermeld.</w:t>
       </w:r>
     </w:p>
     <w:p>
@@ -1527,7 +1509,7 @@
         <w:t xml:space="preserve">”</w:t>
       </w:r>
       <w:r>
-        <w:t xml:space="preserve">: telefooncel vervangen (bijv. een oude prepaidtelefoon uit Daans auto). Auto-fouten: Daan rijdt, Sophie spreekt niet twee keer.</w:t>
+        <w:t xml:space="preserve">: telefooncel vervangen door een oude prepaidtelefoon uit Sophies keukenla. Auto-fouten: Daan rijdt, Sophie spreekt niet twee keer.</w:t>
       </w:r>
     </w:p>
     <w:p>
@@ -1608,6 +1590,309 @@
         <w:t xml:space="preserve">”</w:t>
       </w:r>
       <w:r>
+        <w:t xml:space="preserve">: Bram volgde Lars en Sophie vanaf de woonboot tot de garage.</w:t>
+      </w:r>
+      <w:r>
+        <w:t xml:space="preserve"> </w:t>
+      </w:r>
+      <w:r>
+        <w:t xml:space="preserve">“</w:t>
+      </w:r>
+      <w:r>
+        <w:t xml:space="preserve">Intermezzo: Reva</w:t>
+      </w:r>
+      <w:r>
+        <w:t xml:space="preserve">”</w:t>
+      </w:r>
+      <w:r>
+        <w:t xml:space="preserve"> </w:t>
+      </w:r>
+      <w:r>
+        <w:t xml:space="preserve">blijft op zijn plek; de verwijzingen naar de boerderij zijn eruit gehaald.</w:t>
+      </w:r>
+    </w:p>
+    <w:p>
+      <w:pPr>
+        <w:numPr>
+          <w:ilvl w:val="0"/>
+          <w:numId w:val="1007"/>
+        </w:numPr>
+        <w:pStyle w:val="Compact"/>
+      </w:pPr>
+      <w:r>
+        <w:t xml:space="preserve">“</w:t>
+      </w:r>
+      <w:r>
+        <w:t xml:space="preserve">Het testament in de mergel</w:t>
+      </w:r>
+      <w:r>
+        <w:t xml:space="preserve">”</w:t>
+      </w:r>
+      <w:r>
+        <w:t xml:space="preserve">:</w:t>
+      </w:r>
+      <w:r>
+        <w:t xml:space="preserve"> </w:t>
+      </w:r>
+      <w:r>
+        <w:t xml:space="preserve">“</w:t>
+      </w:r>
+      <w:r>
+        <w:t xml:space="preserve">Ik voel iets. Metaal.</w:t>
+      </w:r>
+      <w:r>
+        <w:t xml:space="preserve">”</w:t>
+      </w:r>
+      <w:r>
+        <w:t xml:space="preserve"> </w:t>
+      </w:r>
+      <w:r>
+        <w:t xml:space="preserve">Kokertje openen.</w:t>
+      </w:r>
+    </w:p>
+    <w:p>
+      <w:pPr>
+        <w:numPr>
+          <w:ilvl w:val="0"/>
+          <w:numId w:val="1007"/>
+        </w:numPr>
+        <w:pStyle w:val="Compact"/>
+      </w:pPr>
+      <w:r>
+        <w:t xml:space="preserve">“</w:t>
+      </w:r>
+      <w:r>
+        <w:t xml:space="preserve">Het mechanisme van de Gulden Snede</w:t>
+      </w:r>
+      <w:r>
+        <w:t xml:space="preserve">”</w:t>
+      </w:r>
+      <w:r>
+        <w:t xml:space="preserve">: 0,618.</w:t>
+      </w:r>
+    </w:p>
+    <w:p>
+      <w:pPr>
+        <w:numPr>
+          <w:ilvl w:val="0"/>
+          <w:numId w:val="1007"/>
+        </w:numPr>
+        <w:pStyle w:val="Compact"/>
+      </w:pPr>
+      <w:r>
+        <w:t xml:space="preserve">“</w:t>
+      </w:r>
+      <w:r>
+        <w:t xml:space="preserve">Een aanbod, geen antwoord</w:t>
+      </w:r>
+      <w:r>
+        <w:t xml:space="preserve">”</w:t>
+      </w:r>
+      <w:r>
+        <w:t xml:space="preserve">: Lars kent de namen Voss en Van der Heijden niet; Van Buren noemt ze.</w:t>
+      </w:r>
+    </w:p>
+    <w:p>
+      <w:pPr>
+        <w:numPr>
+          <w:ilvl w:val="0"/>
+          <w:numId w:val="1007"/>
+        </w:numPr>
+        <w:pStyle w:val="Compact"/>
+      </w:pPr>
+      <w:r>
+        <w:t xml:space="preserve">“</w:t>
+      </w:r>
+      <w:r>
+        <w:t xml:space="preserve">De prijs van ongeduld</w:t>
+      </w:r>
+      <w:r>
+        <w:t xml:space="preserve">”</w:t>
+      </w:r>
+      <w:r>
+        <w:t xml:space="preserve">: tijdlijn herschrijven, Van der Heijden beveelt de boerderij vóór de aanval.</w:t>
+      </w:r>
+    </w:p>
+    <w:p>
+      <w:pPr>
+        <w:numPr>
+          <w:ilvl w:val="0"/>
+          <w:numId w:val="1007"/>
+        </w:numPr>
+        <w:pStyle w:val="Compact"/>
+      </w:pPr>
+      <w:r>
+        <w:t xml:space="preserve">“</w:t>
+      </w:r>
+      <w:r>
+        <w:t xml:space="preserve">Van Burens tegenzet</w:t>
+      </w:r>
+      <w:r>
+        <w:t xml:space="preserve">”</w:t>
+      </w:r>
+      <w:r>
+        <w:t xml:space="preserve">: Van Buren wist van de opname.</w:t>
+      </w:r>
+    </w:p>
+    <w:p>
+      <w:pPr>
+        <w:numPr>
+          <w:ilvl w:val="0"/>
+          <w:numId w:val="1007"/>
+        </w:numPr>
+        <w:pStyle w:val="Compact"/>
+      </w:pPr>
+      <w:r>
+        <w:t xml:space="preserve">“</w:t>
+      </w:r>
+      <w:r>
+        <w:t xml:space="preserve">Hoofdinspecteur Sanders</w:t>
+      </w:r>
+      <w:r>
+        <w:t xml:space="preserve">”</w:t>
+      </w:r>
+      <w:r>
+        <w:t xml:space="preserve">: Aken in plaats van Maastricht, geen</w:t>
+      </w:r>
+      <w:r>
+        <w:t xml:space="preserve"> </w:t>
+      </w:r>
+      <w:r>
+        <w:t xml:space="preserve">“</w:t>
+      </w:r>
+      <w:r>
+        <w:t xml:space="preserve">buitenlandse burger</w:t>
+      </w:r>
+      <w:r>
+        <w:t xml:space="preserve">”</w:t>
+      </w:r>
+      <w:r>
+        <w:t xml:space="preserve">, achternaam werd wel genoemd.</w:t>
+      </w:r>
+    </w:p>
+    <w:p>
+      <w:pPr>
+        <w:numPr>
+          <w:ilvl w:val="0"/>
+          <w:numId w:val="1007"/>
+        </w:numPr>
+        <w:pStyle w:val="Compact"/>
+      </w:pPr>
+      <w:r>
+        <w:t xml:space="preserve">“</w:t>
+      </w:r>
+      <w:r>
+        <w:t xml:space="preserve">Het manuscript van De Architect</w:t>
+      </w:r>
+      <w:r>
+        <w:t xml:space="preserve">”</w:t>
+      </w:r>
+      <w:r>
+        <w:t xml:space="preserve">: inhoud = Verbond der Bouwmeesters plus het register van bewaarders achterin. Van Burens mannen groeven in de nacht van de boerderij-aanval de instorting leeg en stapelden het puin terug; de aannemer ziet dat later.</w:t>
+      </w:r>
+    </w:p>
+    <w:p>
+      <w:pPr>
+        <w:numPr>
+          <w:ilvl w:val="0"/>
+          <w:numId w:val="1007"/>
+        </w:numPr>
+        <w:pStyle w:val="Compact"/>
+      </w:pPr>
+      <w:r>
+        <w:t xml:space="preserve">“</w:t>
+      </w:r>
+      <w:r>
+        <w:t xml:space="preserve">Confrontatie aan de Herengracht</w:t>
+      </w:r>
+      <w:r>
+        <w:t xml:space="preserve">”</w:t>
+      </w:r>
+      <w:r>
+        <w:t xml:space="preserve">: naadfouten herstellen; Van Burens leugen over Arnold.</w:t>
+      </w:r>
+    </w:p>
+    <w:p>
+      <w:pPr>
+        <w:numPr>
+          <w:ilvl w:val="0"/>
+          <w:numId w:val="1007"/>
+        </w:numPr>
+        <w:pStyle w:val="Compact"/>
+      </w:pPr>
+      <w:r>
+        <w:t xml:space="preserve">“</w:t>
+      </w:r>
+      <w:r>
+        <w:t xml:space="preserve">Het huis in Den Haag</w:t>
+      </w:r>
+      <w:r>
+        <w:t xml:space="preserve">”</w:t>
+      </w:r>
+      <w:r>
+        <w:t xml:space="preserve">: verplaatsen naar vóór de Herengracht. Wordt de bekentenis van Arnold.</w:t>
+      </w:r>
+    </w:p>
+    <w:p>
+      <w:pPr>
+        <w:numPr>
+          <w:ilvl w:val="0"/>
+          <w:numId w:val="1007"/>
+        </w:numPr>
+        <w:pStyle w:val="Compact"/>
+      </w:pPr>
+      <w:r>
+        <w:t xml:space="preserve">“</w:t>
+      </w:r>
+      <w:r>
+        <w:t xml:space="preserve">In het ziekenhuis</w:t>
+      </w:r>
+      <w:r>
+        <w:t xml:space="preserve">”</w:t>
+      </w:r>
+      <w:r>
+        <w:t xml:space="preserve">: Daan herkende niet Farah in de garage; Daan zag Piet niet neergeschoten worden.</w:t>
+      </w:r>
+    </w:p>
+    <w:p>
+      <w:pPr>
+        <w:numPr>
+          <w:ilvl w:val="0"/>
+          <w:numId w:val="1007"/>
+        </w:numPr>
+        <w:pStyle w:val="Compact"/>
+      </w:pPr>
+      <w:r>
+        <w:t xml:space="preserve">“</w:t>
+      </w:r>
+      <w:r>
+        <w:t xml:space="preserve">Wat onder de verf blijft</w:t>
+      </w:r>
+      <w:r>
+        <w:t xml:space="preserve">”</w:t>
+      </w:r>
+      <w:r>
+        <w:t xml:space="preserve">: naad hersteld; tweede cirkel geschrapt.</w:t>
+      </w:r>
+    </w:p>
+    <w:p>
+      <w:pPr>
+        <w:numPr>
+          <w:ilvl w:val="0"/>
+          <w:numId w:val="1007"/>
+        </w:numPr>
+        <w:pStyle w:val="Compact"/>
+      </w:pPr>
+      <w:r>
+        <w:t xml:space="preserve">“</w:t>
+      </w:r>
+      <w:r>
+        <w:t xml:space="preserve">Zes weken later</w:t>
+      </w:r>
+      <w:r>
+        <w:t xml:space="preserve">”</w:t>
+      </w:r>
+      <w:r>
         <w:t xml:space="preserve"> </w:t>
       </w:r>
       <w:r>
@@ -1620,22 +1905,55 @@
         <w:t xml:space="preserve">“</w:t>
       </w:r>
       <w:r>
-        <w:t xml:space="preserve">Intermezzo: Reva</w:t>
-      </w:r>
-      <w:r>
-        <w:t xml:space="preserve">”</w:t>
-      </w:r>
-      <w:r>
-        <w:t xml:space="preserve">: hoe Het Nieuwe Licht de garage vindt (cameranet rond Rijksmuseum, auto gevolgd). Intermezzo verplaatsen naar na</w:t>
-      </w:r>
-      <w:r>
-        <w:t xml:space="preserve"> </w:t>
-      </w:r>
-      <w:r>
-        <w:t xml:space="preserve">“</w:t>
-      </w:r>
-      <w:r>
-        <w:t xml:space="preserve">De prijs van ongeduld</w:t>
+        <w:t xml:space="preserve">Verzoening bij Piet</w:t>
+      </w:r>
+      <w:r>
+        <w:t xml:space="preserve">”</w:t>
+      </w:r>
+      <w:r>
+        <w:t xml:space="preserve"> </w:t>
+      </w:r>
+      <w:r>
+        <w:t xml:space="preserve">geschrapt (tekst bewaard in Wijzigingslog.md).</w:t>
+      </w:r>
+    </w:p>
+    <w:p>
+      <w:pPr>
+        <w:numPr>
+          <w:ilvl w:val="0"/>
+          <w:numId w:val="1007"/>
+        </w:numPr>
+        <w:pStyle w:val="Compact"/>
+      </w:pPr>
+      <w:r>
+        <w:t xml:space="preserve">Overal: Voss, Beelen, Reva, Isaak volgens tabel;</w:t>
+      </w:r>
+      <w:r>
+        <w:t xml:space="preserve"> </w:t>
+      </w:r>
+      <w:r>
+        <w:t xml:space="preserve">“</w:t>
+      </w:r>
+      <w:r>
+        <w:t xml:space="preserve">driehonderdvijftig jaar</w:t>
+      </w:r>
+      <w:r>
+        <w:t xml:space="preserve">”</w:t>
+      </w:r>
+      <w:r>
+        <w:t xml:space="preserve"> </w:t>
+      </w:r>
+      <w:r>
+        <w:t xml:space="preserve">naar</w:t>
+      </w:r>
+      <w:r>
+        <w:t xml:space="preserve"> </w:t>
+      </w:r>
+      <w:r>
+        <w:t xml:space="preserve">“</w:t>
+      </w:r>
+      <w:r>
+        <w:t xml:space="preserve">bijna vierhonderd jaar</w:t>
       </w:r>
       <w:r>
         <w:t xml:space="preserve">”</w:t>
@@ -1644,335 +1962,14 @@
         <w:t xml:space="preserve">.</w:t>
       </w:r>
     </w:p>
-    <w:p>
-      <w:pPr>
-        <w:numPr>
-          <w:ilvl w:val="0"/>
-          <w:numId w:val="1007"/>
-        </w:numPr>
-        <w:pStyle w:val="Compact"/>
-      </w:pPr>
-      <w:r>
-        <w:t xml:space="preserve">“</w:t>
-      </w:r>
-      <w:r>
-        <w:t xml:space="preserve">Het testament in de mergel</w:t>
-      </w:r>
-      <w:r>
-        <w:t xml:space="preserve">”</w:t>
-      </w:r>
-      <w:r>
-        <w:t xml:space="preserve">:</w:t>
-      </w:r>
-      <w:r>
-        <w:t xml:space="preserve"> </w:t>
-      </w:r>
-      <w:r>
-        <w:t xml:space="preserve">“</w:t>
-      </w:r>
-      <w:r>
-        <w:t xml:space="preserve">Ik voel iets. Metaal.</w:t>
-      </w:r>
-      <w:r>
-        <w:t xml:space="preserve">”</w:t>
-      </w:r>
-      <w:r>
-        <w:t xml:space="preserve"> </w:t>
-      </w:r>
-      <w:r>
-        <w:t xml:space="preserve">Kokertje openen.</w:t>
-      </w:r>
-    </w:p>
-    <w:p>
-      <w:pPr>
-        <w:numPr>
-          <w:ilvl w:val="0"/>
-          <w:numId w:val="1007"/>
-        </w:numPr>
-        <w:pStyle w:val="Compact"/>
-      </w:pPr>
-      <w:r>
-        <w:t xml:space="preserve">“</w:t>
-      </w:r>
-      <w:r>
-        <w:t xml:space="preserve">Het mechanisme van de Gulden Snede</w:t>
-      </w:r>
-      <w:r>
-        <w:t xml:space="preserve">”</w:t>
-      </w:r>
-      <w:r>
-        <w:t xml:space="preserve">: 0,618.</w:t>
-      </w:r>
-    </w:p>
-    <w:p>
-      <w:pPr>
-        <w:numPr>
-          <w:ilvl w:val="0"/>
-          <w:numId w:val="1007"/>
-        </w:numPr>
-        <w:pStyle w:val="Compact"/>
-      </w:pPr>
-      <w:r>
-        <w:t xml:space="preserve">“</w:t>
-      </w:r>
-      <w:r>
-        <w:t xml:space="preserve">Een aanbod, geen antwoord</w:t>
-      </w:r>
-      <w:r>
-        <w:t xml:space="preserve">”</w:t>
-      </w:r>
-      <w:r>
-        <w:t xml:space="preserve">: Lars kent de namen Voss en Van der Heijden niet; Van Buren noemt ze.</w:t>
-      </w:r>
-    </w:p>
-    <w:p>
-      <w:pPr>
-        <w:numPr>
-          <w:ilvl w:val="0"/>
-          <w:numId w:val="1007"/>
-        </w:numPr>
-        <w:pStyle w:val="Compact"/>
-      </w:pPr>
-      <w:r>
-        <w:t xml:space="preserve">“</w:t>
-      </w:r>
-      <w:r>
-        <w:t xml:space="preserve">De prijs van ongeduld</w:t>
-      </w:r>
-      <w:r>
-        <w:t xml:space="preserve">”</w:t>
-      </w:r>
-      <w:r>
-        <w:t xml:space="preserve">: tijdlijn herschrijven, Van der Heijden beveelt de boerderij vóór de aanval.</w:t>
-      </w:r>
-    </w:p>
-    <w:p>
-      <w:pPr>
-        <w:numPr>
-          <w:ilvl w:val="0"/>
-          <w:numId w:val="1007"/>
-        </w:numPr>
-        <w:pStyle w:val="Compact"/>
-      </w:pPr>
-      <w:r>
-        <w:t xml:space="preserve">“</w:t>
-      </w:r>
-      <w:r>
-        <w:t xml:space="preserve">Van Burens tegenzet</w:t>
-      </w:r>
-      <w:r>
-        <w:t xml:space="preserve">”</w:t>
-      </w:r>
-      <w:r>
-        <w:t xml:space="preserve">: Van Buren wist van de opname.</w:t>
-      </w:r>
-    </w:p>
-    <w:p>
-      <w:pPr>
-        <w:numPr>
-          <w:ilvl w:val="0"/>
-          <w:numId w:val="1007"/>
-        </w:numPr>
-        <w:pStyle w:val="Compact"/>
-      </w:pPr>
-      <w:r>
-        <w:t xml:space="preserve">“</w:t>
-      </w:r>
-      <w:r>
-        <w:t xml:space="preserve">Hoofdinspecteur Sanders</w:t>
-      </w:r>
-      <w:r>
-        <w:t xml:space="preserve">”</w:t>
-      </w:r>
-      <w:r>
-        <w:t xml:space="preserve">: Aken in plaats van Maastricht, geen</w:t>
-      </w:r>
-      <w:r>
-        <w:t xml:space="preserve"> </w:t>
-      </w:r>
-      <w:r>
-        <w:t xml:space="preserve">“</w:t>
-      </w:r>
-      <w:r>
-        <w:t xml:space="preserve">buitenlandse burger</w:t>
-      </w:r>
-      <w:r>
-        <w:t xml:space="preserve">”</w:t>
-      </w:r>
-      <w:r>
-        <w:t xml:space="preserve">, achternaam werd wel genoemd.</w:t>
-      </w:r>
-    </w:p>
-    <w:p>
-      <w:pPr>
-        <w:numPr>
-          <w:ilvl w:val="0"/>
-          <w:numId w:val="1007"/>
-        </w:numPr>
-        <w:pStyle w:val="Compact"/>
-      </w:pPr>
-      <w:r>
-        <w:t xml:space="preserve">“</w:t>
-      </w:r>
-      <w:r>
-        <w:t xml:space="preserve">Het manuscript van De Architect</w:t>
-      </w:r>
-      <w:r>
-        <w:t xml:space="preserve">”</w:t>
-      </w:r>
-      <w:r>
-        <w:t xml:space="preserve">: inhoud = Verbond der Bouwmeesters; hoe zijn mannen langs het mechanisme kwamen (oude tweede toegang die alleen de loge kende).</w:t>
-      </w:r>
-    </w:p>
-    <w:p>
-      <w:pPr>
-        <w:numPr>
-          <w:ilvl w:val="0"/>
-          <w:numId w:val="1007"/>
-        </w:numPr>
-        <w:pStyle w:val="Compact"/>
-      </w:pPr>
-      <w:r>
-        <w:t xml:space="preserve">“</w:t>
-      </w:r>
-      <w:r>
-        <w:t xml:space="preserve">Confrontatie aan de Herengracht</w:t>
-      </w:r>
-      <w:r>
-        <w:t xml:space="preserve">”</w:t>
-      </w:r>
-      <w:r>
-        <w:t xml:space="preserve">: naadfouten herstellen; Van Burens leugen over Arnold.</w:t>
-      </w:r>
-    </w:p>
-    <w:p>
-      <w:pPr>
-        <w:numPr>
-          <w:ilvl w:val="0"/>
-          <w:numId w:val="1007"/>
-        </w:numPr>
-        <w:pStyle w:val="Compact"/>
-      </w:pPr>
-      <w:r>
-        <w:t xml:space="preserve">“</w:t>
-      </w:r>
-      <w:r>
-        <w:t xml:space="preserve">Het huis in Den Haag</w:t>
-      </w:r>
-      <w:r>
-        <w:t xml:space="preserve">”</w:t>
-      </w:r>
-      <w:r>
-        <w:t xml:space="preserve">: verplaatsen naar vóór de Herengracht. Wordt de bekentenis van Arnold.</w:t>
-      </w:r>
-    </w:p>
-    <w:p>
-      <w:pPr>
-        <w:numPr>
-          <w:ilvl w:val="0"/>
-          <w:numId w:val="1007"/>
-        </w:numPr>
-        <w:pStyle w:val="Compact"/>
-      </w:pPr>
-      <w:r>
-        <w:t xml:space="preserve">“</w:t>
-      </w:r>
-      <w:r>
-        <w:t xml:space="preserve">In het ziekenhuis</w:t>
-      </w:r>
-      <w:r>
-        <w:t xml:space="preserve">”</w:t>
-      </w:r>
-      <w:r>
-        <w:t xml:space="preserve">: Daan herkende niet Farah in de garage; Daan zag Piet niet neergeschoten worden.</w:t>
-      </w:r>
-    </w:p>
-    <w:p>
-      <w:pPr>
-        <w:numPr>
-          <w:ilvl w:val="0"/>
-          <w:numId w:val="1007"/>
-        </w:numPr>
-        <w:pStyle w:val="Compact"/>
-      </w:pPr>
-      <w:r>
-        <w:t xml:space="preserve">“</w:t>
-      </w:r>
-      <w:r>
-        <w:t xml:space="preserve">Wat onder de verf blijft</w:t>
-      </w:r>
-      <w:r>
-        <w:t xml:space="preserve">”</w:t>
-      </w:r>
-      <w:r>
-        <w:t xml:space="preserve">: naad in de dialoog; tweede cirkel uitwerken of schrappen.</w:t>
-      </w:r>
-    </w:p>
-    <w:p>
-      <w:pPr>
-        <w:numPr>
-          <w:ilvl w:val="0"/>
-          <w:numId w:val="1007"/>
-        </w:numPr>
-        <w:pStyle w:val="Compact"/>
-      </w:pPr>
-      <w:r>
-        <w:t xml:space="preserve">Afwikkelhoofdstukken samenvoegen tot drie.</w:t>
-      </w:r>
-    </w:p>
-    <w:p>
-      <w:pPr>
-        <w:numPr>
-          <w:ilvl w:val="0"/>
-          <w:numId w:val="1007"/>
-        </w:numPr>
-        <w:pStyle w:val="Compact"/>
-      </w:pPr>
-      <w:r>
-        <w:t xml:space="preserve">Overal: Voss, Beelen, Reva, Isaak volgens tabel;</w:t>
-      </w:r>
-      <w:r>
-        <w:t xml:space="preserve"> </w:t>
-      </w:r>
-      <w:r>
-        <w:t xml:space="preserve">“</w:t>
-      </w:r>
-      <w:r>
-        <w:t xml:space="preserve">driehonderdvijftig jaar</w:t>
-      </w:r>
-      <w:r>
-        <w:t xml:space="preserve">”</w:t>
-      </w:r>
-      <w:r>
-        <w:t xml:space="preserve"> </w:t>
-      </w:r>
-      <w:r>
-        <w:t xml:space="preserve">naar</w:t>
-      </w:r>
-      <w:r>
-        <w:t xml:space="preserve"> </w:t>
-      </w:r>
-      <w:r>
-        <w:t xml:space="preserve">“</w:t>
-      </w:r>
-      <w:r>
-        <w:t xml:space="preserve">bijna vierhonderd jaar</w:t>
-      </w:r>
-      <w:r>
-        <w:t xml:space="preserve">”</w:t>
-      </w:r>
-      <w:r>
-        <w:t xml:space="preserve">.</w:t>
-      </w:r>
-    </w:p>
     <w:bookmarkEnd w:id="29"/>
-    <w:bookmarkStart w:id="30" w:name="nieuwe-structuur-tweede-helft-voorstel"/>
+    <w:bookmarkStart w:id="30" w:name="structuur-tweede-helft-doorgevoerd-in-v4"/>
     <w:p>
       <w:pPr>
         <w:pStyle w:val="Heading1"/>
       </w:pPr>
       <w:r>
-        <w:t xml:space="preserve">4. Nieuwe structuur tweede helft (voorstel)</w:t>
+        <w:t xml:space="preserve">4. Structuur tweede helft (doorgevoerd in v4)</w:t>
       </w:r>
     </w:p>
     <w:p>
@@ -2094,6 +2091,418 @@
       </w:r>
     </w:p>
     <w:bookmarkEnd w:id="30"/>
+    <w:bookmarkStart w:id="31" w:name="ontknoping-vastgelegd-in-v4"/>
+    <w:p>
+      <w:pPr>
+        <w:pStyle w:val="Heading1"/>
+      </w:pPr>
+      <w:r>
+        <w:t xml:space="preserve">5. Ontknoping (vastgelegd in v4)</w:t>
+      </w:r>
+    </w:p>
+    <w:p>
+      <w:pPr>
+        <w:numPr>
+          <w:ilvl w:val="0"/>
+          <w:numId w:val="1009"/>
+        </w:numPr>
+        <w:pStyle w:val="Compact"/>
+      </w:pPr>
+      <w:r>
+        <w:rPr>
+          <w:bCs/>
+          <w:b/>
+        </w:rPr>
+        <w:t xml:space="preserve">Terugkeer naar de tombe:</w:t>
+      </w:r>
+      <w:r>
+        <w:t xml:space="preserve"> </w:t>
+      </w:r>
+      <w:r>
+        <w:t xml:space="preserve">de aannemer ziet dat het puin al is weggegraven en teruggestapeld. Bij de schacht laat Sanders een lamp zakken: krassen in de wand, vijf strepen naast elkaar.</w:t>
+      </w:r>
+      <w:r>
+        <w:t xml:space="preserve"> </w:t>
+      </w:r>
+      <w:r>
+        <w:t xml:space="preserve">“</w:t>
+      </w:r>
+      <w:r>
+        <w:t xml:space="preserve">Iemand die op slag dood is, krabt niet aan de muur.</w:t>
+      </w:r>
+      <w:r>
+        <w:t xml:space="preserve">”</w:t>
+      </w:r>
+    </w:p>
+    <w:p>
+      <w:pPr>
+        <w:numPr>
+          <w:ilvl w:val="0"/>
+          <w:numId w:val="1009"/>
+        </w:numPr>
+        <w:pStyle w:val="Compact"/>
+      </w:pPr>
+      <w:r>
+        <w:rPr>
+          <w:bCs/>
+          <w:b/>
+        </w:rPr>
+        <w:t xml:space="preserve">Aken (Het geheim van de vader):</w:t>
+      </w:r>
+      <w:r>
+        <w:t xml:space="preserve"> </w:t>
+      </w:r>
+      <w:r>
+        <w:t xml:space="preserve">in de kantlijn van het notitieboek staat</w:t>
+      </w:r>
+      <w:r>
+        <w:t xml:space="preserve"> </w:t>
+      </w:r>
+      <w:r>
+        <w:t xml:space="preserve">“</w:t>
+      </w:r>
+      <w:r>
+        <w:t xml:space="preserve">A. zegt: sommige vragen kunnen beter in de kantlijn blijven</w:t>
+      </w:r>
+      <w:r>
+        <w:t xml:space="preserve">”</w:t>
+      </w:r>
+      <w:r>
+        <w:t xml:space="preserve">. Sophie herkent de zin van haar vader en liegt voor het eerst tegen Lars (</w:t>
+      </w:r>
+      <w:r>
+        <w:t xml:space="preserve">“</w:t>
+      </w:r>
+      <w:r>
+        <w:t xml:space="preserve">Niets</w:t>
+      </w:r>
+      <w:r>
+        <w:t xml:space="preserve">”</w:t>
+      </w:r>
+      <w:r>
+        <w:t xml:space="preserve">).</w:t>
+      </w:r>
+    </w:p>
+    <w:p>
+      <w:pPr>
+        <w:numPr>
+          <w:ilvl w:val="0"/>
+          <w:numId w:val="1009"/>
+        </w:numPr>
+        <w:pStyle w:val="Compact"/>
+      </w:pPr>
+      <w:r>
+        <w:rPr>
+          <w:bCs/>
+          <w:b/>
+        </w:rPr>
+        <w:t xml:space="preserve">Het huis in Den Haag</w:t>
+      </w:r>
+      <w:r>
+        <w:t xml:space="preserve"> </w:t>
+      </w:r>
+      <w:r>
+        <w:t xml:space="preserve">(nu vóór de Herengracht): Sophie gaat alleen, met de trein vanuit Maastricht. Arnold bekent. Het laatje bevat Eriks kaart (rood kruis,</w:t>
+      </w:r>
+      <w:r>
+        <w:t xml:space="preserve"> </w:t>
+      </w:r>
+      <w:r>
+        <w:t xml:space="preserve">“</w:t>
+      </w:r>
+      <w:r>
+        <w:t xml:space="preserve">Schacht</w:t>
+      </w:r>
+      <w:r>
+        <w:t xml:space="preserve">”</w:t>
+      </w:r>
+      <w:r>
+        <w:t xml:space="preserve">) en de brieven aan Marieke. Arnold gaat de volgende ochtend om negen uur naar de politie en vraagt één nacht om het Lars zelf te vertellen.</w:t>
+      </w:r>
+    </w:p>
+    <w:p>
+      <w:pPr>
+        <w:numPr>
+          <w:ilvl w:val="0"/>
+          <w:numId w:val="1009"/>
+        </w:numPr>
+        <w:pStyle w:val="Compact"/>
+      </w:pPr>
+      <w:r>
+        <w:rPr>
+          <w:bCs/>
+          <w:b/>
+        </w:rPr>
+        <w:t xml:space="preserve">Het spoor naar de Herengracht:</w:t>
+      </w:r>
+      <w:r>
+        <w:t xml:space="preserve"> </w:t>
+      </w:r>
+      <w:r>
+        <w:t xml:space="preserve">Sophie geeft de kaart om half twaalf aan Sanders, achter het Amstelstation. Tegen Lars zegt ze:</w:t>
+      </w:r>
+      <w:r>
+        <w:t xml:space="preserve"> </w:t>
+      </w:r>
+      <w:r>
+        <w:t xml:space="preserve">“</w:t>
+      </w:r>
+      <w:r>
+        <w:t xml:space="preserve">Morgen.</w:t>
+      </w:r>
+      <w:r>
+        <w:t xml:space="preserve">”</w:t>
+      </w:r>
+    </w:p>
+    <w:p>
+      <w:pPr>
+        <w:numPr>
+          <w:ilvl w:val="0"/>
+          <w:numId w:val="1009"/>
+        </w:numPr>
+        <w:pStyle w:val="Compact"/>
+      </w:pPr>
+      <w:r>
+        <w:rPr>
+          <w:bCs/>
+          <w:b/>
+        </w:rPr>
+        <w:t xml:space="preserve">Confrontatie aan de Herengracht:</w:t>
+      </w:r>
+      <w:r>
+        <w:t xml:space="preserve"> </w:t>
+      </w:r>
+      <w:r>
+        <w:t xml:space="preserve">Van Buren liegt (</w:t>
+      </w:r>
+      <w:r>
+        <w:t xml:space="preserve">“</w:t>
+      </w:r>
+      <w:r>
+        <w:t xml:space="preserve">ik heb iemand gestuurd om te praten</w:t>
+      </w:r>
+      <w:r>
+        <w:t xml:space="preserve">”</w:t>
+      </w:r>
+      <w:r>
+        <w:t xml:space="preserve">) en wijst daarna zelf naar Sophie:</w:t>
+      </w:r>
+      <w:r>
+        <w:t xml:space="preserve"> </w:t>
+      </w:r>
+      <w:r>
+        <w:t xml:space="preserve">“</w:t>
+      </w:r>
+      <w:r>
+        <w:t xml:space="preserve">Zij was gisteravond in Den Haag.</w:t>
+      </w:r>
+      <w:r>
+        <w:t xml:space="preserve">”</w:t>
+      </w:r>
+      <w:r>
+        <w:t xml:space="preserve"> </w:t>
+      </w:r>
+      <w:r>
+        <w:t xml:space="preserve">Sophie legt de kaart op tafel en zegt het. Lars vraagt:</w:t>
+      </w:r>
+      <w:r>
+        <w:t xml:space="preserve"> </w:t>
+      </w:r>
+      <w:r>
+        <w:t xml:space="preserve">“</w:t>
+      </w:r>
+      <w:r>
+        <w:t xml:space="preserve">Hoe lang heeft het geduurd?</w:t>
+      </w:r>
+      <w:r>
+        <w:t xml:space="preserve">”</w:t>
+      </w:r>
+      <w:r>
+        <w:t xml:space="preserve"> </w:t>
+      </w:r>
+      <w:r>
+        <w:t xml:space="preserve">Van Buren:</w:t>
+      </w:r>
+      <w:r>
+        <w:t xml:space="preserve"> </w:t>
+      </w:r>
+      <w:r>
+        <w:t xml:space="preserve">“</w:t>
+      </w:r>
+      <w:r>
+        <w:t xml:space="preserve">Ik heb het nooit gevraagd.</w:t>
+      </w:r>
+      <w:r>
+        <w:t xml:space="preserve">”</w:t>
+      </w:r>
+    </w:p>
+    <w:p>
+      <w:pPr>
+        <w:numPr>
+          <w:ilvl w:val="0"/>
+          <w:numId w:val="1009"/>
+        </w:numPr>
+        <w:pStyle w:val="Compact"/>
+      </w:pPr>
+      <w:r>
+        <w:rPr>
+          <w:bCs/>
+          <w:b/>
+        </w:rPr>
+        <w:t xml:space="preserve">Uitkomst manuscript:</w:t>
+      </w:r>
+      <w:r>
+        <w:t xml:space="preserve"> </w:t>
+      </w:r>
+      <w:r>
+        <w:t xml:space="preserve">het Verbond (1642) wordt wetenschappelijk uitgegeven door Lars en Sophie. De namen van Van Buren en Arnold gaan naar Sanders als bewijs. De overige namen in het register worden 75 jaar verzegeld bij een notaris die de rechtbank aanwijst; Van der Heijden krijgt een verzegelde kopie.</w:t>
+      </w:r>
+    </w:p>
+    <w:p>
+      <w:pPr>
+        <w:numPr>
+          <w:ilvl w:val="0"/>
+          <w:numId w:val="1009"/>
+        </w:numPr>
+        <w:pStyle w:val="Compact"/>
+      </w:pPr>
+      <w:r>
+        <w:rPr>
+          <w:bCs/>
+          <w:b/>
+        </w:rPr>
+        <w:t xml:space="preserve">Arrestatie:</w:t>
+      </w:r>
+      <w:r>
+        <w:t xml:space="preserve"> </w:t>
+      </w:r>
+      <w:r>
+        <w:t xml:space="preserve">Sanders houdt Van Buren aan in zijn bibliotheek. Zijn laatste zin tegen Sophie:</w:t>
+      </w:r>
+      <w:r>
+        <w:t xml:space="preserve"> </w:t>
+      </w:r>
+      <w:r>
+        <w:t xml:space="preserve">“</w:t>
+      </w:r>
+      <w:r>
+        <w:t xml:space="preserve">Zeg uw vader dat hij om negen uur niet te laat moet komen.</w:t>
+      </w:r>
+      <w:r>
+        <w:t xml:space="preserve">”</w:t>
+      </w:r>
+    </w:p>
+    <w:p>
+      <w:pPr>
+        <w:numPr>
+          <w:ilvl w:val="0"/>
+          <w:numId w:val="1009"/>
+        </w:numPr>
+        <w:pStyle w:val="Compact"/>
+      </w:pPr>
+      <w:r>
+        <w:rPr>
+          <w:bCs/>
+          <w:b/>
+        </w:rPr>
+        <w:t xml:space="preserve">Vervolging:</w:t>
+      </w:r>
+      <w:r>
+        <w:t xml:space="preserve"> </w:t>
+      </w:r>
+      <w:r>
+        <w:t xml:space="preserve">Van Buren en Arnold worden beiden vervolgd voor het in hulpeloze toestand laten van Erik, met de dood tot gevolg; bij Van Buren overweegt de officier ook uitlokking. Van Buren is in afwachting van zijn proces op vrije voeten met een enkelband. (Juridische details nog laten toetsen.)</w:t>
+      </w:r>
+    </w:p>
+    <w:p>
+      <w:pPr>
+        <w:numPr>
+          <w:ilvl w:val="0"/>
+          <w:numId w:val="1009"/>
+        </w:numPr>
+        <w:pStyle w:val="Compact"/>
+      </w:pPr>
+      <w:r>
+        <w:rPr>
+          <w:bCs/>
+          <w:b/>
+        </w:rPr>
+        <w:t xml:space="preserve">De nieuwe bewaarder:</w:t>
+      </w:r>
+      <w:r>
+        <w:t xml:space="preserve"> </w:t>
+      </w:r>
+      <w:r>
+        <w:t xml:space="preserve">een week later. Lars heeft een brief van Arnold gekregen. Lars en Sophie praten het uit voor hij zijn naam in de steen zet.</w:t>
+      </w:r>
+    </w:p>
+    <w:p>
+      <w:pPr>
+        <w:numPr>
+          <w:ilvl w:val="0"/>
+          <w:numId w:val="1009"/>
+        </w:numPr>
+        <w:pStyle w:val="Compact"/>
+      </w:pPr>
+      <w:r>
+        <w:rPr>
+          <w:bCs/>
+          <w:b/>
+        </w:rPr>
+        <w:t xml:space="preserve">Het museum:</w:t>
+      </w:r>
+      <w:r>
+        <w:t xml:space="preserve"> </w:t>
+      </w:r>
+      <w:r>
+        <w:t xml:space="preserve">de scan gaat compleet online, met een bord ernaast dat het verhaal vertelt.</w:t>
+      </w:r>
+    </w:p>
+    <w:p>
+      <w:pPr>
+        <w:numPr>
+          <w:ilvl w:val="0"/>
+          <w:numId w:val="1009"/>
+        </w:numPr>
+        <w:pStyle w:val="Compact"/>
+      </w:pPr>
+      <w:r>
+        <w:rPr>
+          <w:bCs/>
+          <w:b/>
+        </w:rPr>
+        <w:t xml:space="preserve">Marieke:</w:t>
+      </w:r>
+      <w:r>
+        <w:t xml:space="preserve"> </w:t>
+      </w:r>
+      <w:r>
+        <w:t xml:space="preserve">werd nooit teruggebeld. Isaak geeft haar Arnolds brieven.</w:t>
+      </w:r>
+    </w:p>
+    <w:p>
+      <w:pPr>
+        <w:numPr>
+          <w:ilvl w:val="0"/>
+          <w:numId w:val="1009"/>
+        </w:numPr>
+        <w:pStyle w:val="Compact"/>
+      </w:pPr>
+      <w:r>
+        <w:rPr>
+          <w:bCs/>
+          <w:b/>
+        </w:rPr>
+        <w:t xml:space="preserve">Daan:</w:t>
+      </w:r>
+      <w:r>
+        <w:t xml:space="preserve"> </w:t>
+      </w:r>
+      <w:r>
+        <w:t xml:space="preserve">herkende het symbool op Sophies scan van de lezing van Van der Heijden; hij herkende Farah niet.</w:t>
+      </w:r>
+    </w:p>
+    <w:bookmarkEnd w:id="31"/>
     <w:sectPr/>
   </w:body>
 </w:document>
@@ -2468,6 +2877,9 @@
     <w:lvlOverride w:ilvl="8">
       <w:startOverride w:val="1"/>
     </w:lvlOverride>
+  </w:num>
+  <w:num w:numId="1009">
+    <w:abstractNumId w:val="991"/>
   </w:num>
 </w:numbering>
 </file>

</xml_diff>

<commit_message>
Manuscript v5: schuldig verzuim en nieuw hoofdstuk Twee meter
Co-Authored-By: Claude Opus 5.5 <noreply@anthropic.com>
Claude-Session: https://claude.ai/code/session_01NePC8cCoeqbRjNexdJRDxm
</commit_message>
<xml_diff>
--- a/story-bible/Story_Bible_De_Schaduw_van_de_Nachtwacht.docx
+++ b/story-bible/Story_Bible_De_Schaduw_van_de_Nachtwacht.docx
@@ -87,7 +87,22 @@
         <w:pStyle w:val="BodyText"/>
       </w:pPr>
       <w:r>
-        <w:t xml:space="preserve">Laatste update: 12 oktober 2026. Manuscript v4: proloog herschreven, continuïteitslijst doorgevoerd, ontknoping herschreven.</w:t>
+        <w:t xml:space="preserve">Laatste update: 12 oktober 2026. Manuscript v5: als v4, plus schuldig verzuim als tenlastelegging en het nieuwe hoofdstuk</w:t>
+      </w:r>
+      <w:r>
+        <w:t xml:space="preserve"> </w:t>
+      </w:r>
+      <w:r>
+        <w:t xml:space="preserve">“</w:t>
+      </w:r>
+      <w:r>
+        <w:t xml:space="preserve">Twee meter</w:t>
+      </w:r>
+      <w:r>
+        <w:t xml:space="preserve">”</w:t>
+      </w:r>
+      <w:r>
+        <w:t xml:space="preserve">.</w:t>
       </w:r>
     </w:p>
     <w:bookmarkEnd w:id="20"/>
@@ -397,7 +412,7 @@
         <w:pStyle w:val="Compact"/>
       </w:pPr>
       <w:r>
-        <w:t xml:space="preserve">Als Arnold praat, is Van Buren strafbaar (uitlokking; laten sterven van een hulpbehoevende). Doodslag verjaarde destijds na vijftien jaar; twaalf jaar is binnen die termijn. Juridische details nog laten toetsen.</w:t>
+        <w:t xml:space="preserve">Als Arnold praat, is Van Buren strafbaar: schuldig verzuim met de dood tot gevolg, en uitlokking. (Keuze van de auteur.)</w:t>
       </w:r>
     </w:p>
     <w:p>
@@ -2377,7 +2392,7 @@
         <w:t xml:space="preserve"> </w:t>
       </w:r>
       <w:r>
-        <w:t xml:space="preserve">Sanders houdt Van Buren aan in zijn bibliotheek. Zijn laatste zin tegen Sophie:</w:t>
+        <w:t xml:space="preserve">Sanders houdt Van Buren aan in zijn bibliotheek, op verdenking van schuldig verzuim met de dood van Erik tot gevolg. Zijn laatste zin tegen Sophie:</w:t>
       </w:r>
       <w:r>
         <w:t xml:space="preserve"> </w:t>
@@ -2411,7 +2426,66 @@
         <w:t xml:space="preserve"> </w:t>
       </w:r>
       <w:r>
-        <w:t xml:space="preserve">Van Buren en Arnold worden beiden vervolgd voor het in hulpeloze toestand laten van Erik, met de dood tot gevolg; bij Van Buren overweegt de officier ook uitlokking. Van Buren is in afwachting van zijn proces op vrije voeten met een enkelband. (Juridische details nog laten toetsen.)</w:t>
+        <w:t xml:space="preserve">Van Buren en Arnold worden beiden vervolgd voor schuldig verzuim met de dood van Erik tot gevolg; bij Van Buren overweegt de officier ook uitlokking. Van Buren is in afwachting van zijn proces op vrije voeten met een enkelband.</w:t>
+      </w:r>
+    </w:p>
+    <w:p>
+      <w:pPr>
+        <w:numPr>
+          <w:ilvl w:val="0"/>
+          <w:numId w:val="1009"/>
+        </w:numPr>
+        <w:pStyle w:val="Compact"/>
+      </w:pPr>
+      <w:r>
+        <w:rPr>
+          <w:bCs/>
+          <w:b/>
+        </w:rPr>
+        <w:t xml:space="preserve">In het ziekenhuis:</w:t>
+      </w:r>
+      <w:r>
+        <w:t xml:space="preserve"> </w:t>
+      </w:r>
+      <w:r>
+        <w:t xml:space="preserve">Lars en Sophie staan aan weerszijden van de kamer; alleen Piet merkt het.</w:t>
+      </w:r>
+    </w:p>
+    <w:p>
+      <w:pPr>
+        <w:numPr>
+          <w:ilvl w:val="0"/>
+          <w:numId w:val="1009"/>
+        </w:numPr>
+        <w:pStyle w:val="Compact"/>
+      </w:pPr>
+      <w:r>
+        <w:rPr>
+          <w:bCs/>
+          <w:b/>
+        </w:rPr>
+        <w:t xml:space="preserve">Twee meter</w:t>
+      </w:r>
+      <w:r>
+        <w:t xml:space="preserve"> </w:t>
+      </w:r>
+      <w:r>
+        <w:t xml:space="preserve">(nieuw hoofdstuk, vijf dagen na de Herengracht): Lars komt ’s avonds in de regen naar de woonboot met Arnolds brief van vier kantjes (Erik riep twee keer zijn naam). Lars herkent de ingelijste foto van de streng kijkende man als Arnold. Ruzie en uitspraak: Sophie gaf haar vader die nacht omdat hij haar vader is; Lars begrijpt het en wil boos blijven, maar dat lukt niet. Beschuit, thee. Marieke weet het nog niet. Sophie wil de ring</w:t>
+      </w:r>
+      <w:r>
+        <w:t xml:space="preserve"> </w:t>
+      </w:r>
+      <w:r>
+        <w:t xml:space="preserve">“</w:t>
+      </w:r>
+      <w:r>
+        <w:t xml:space="preserve">nog niet</w:t>
+      </w:r>
+      <w:r>
+        <w:t xml:space="preserve">”</w:t>
+      </w:r>
+      <w:r>
+        <w:t xml:space="preserve">. Lars vraagt haar zaterdag mee naar de berg. Ze steekt de twee meter over.</w:t>
       </w:r>
     </w:p>
     <w:p>
@@ -2433,7 +2507,7 @@
         <w:t xml:space="preserve"> </w:t>
       </w:r>
       <w:r>
-        <w:t xml:space="preserve">een week later. Lars heeft een brief van Arnold gekregen. Lars en Sophie praten het uit voor hij zijn naam in de steen zet.</w:t>
+        <w:t xml:space="preserve">een week na de Herengracht, op zaterdag. Lars zet zijn naam in de steen, met Sophie naast zich.</w:t>
       </w:r>
     </w:p>
     <w:p>

</xml_diff>

<commit_message>
Manuscript v6: verhaallijn gecontroleerd en tegenstrijdigheden hersteld
Tijdlijn dag 1 en 2 rechtgezet, Arnolds terugkeer verklaart Eriks naam
in de kamer, symboliek en loopbaan Isaak gelijkgetrokken. Story bible
uitgebreid met tijdlijn per dag.

Co-Authored-By: Claude Opus 5.5 <noreply@anthropic.com>
Claude-Session: https://claude.ai/code/session_01NePC8cCoeqbRjNexdJRDxm
</commit_message>
<xml_diff>
--- a/story-bible/Story_Bible_De_Schaduw_van_de_Nachtwacht.docx
+++ b/story-bible/Story_Bible_De_Schaduw_van_de_Nachtwacht.docx
@@ -87,22 +87,7 @@
         <w:pStyle w:val="BodyText"/>
       </w:pPr>
       <w:r>
-        <w:t xml:space="preserve">Laatste update: 12 oktober 2026. Manuscript v5: als v4, plus schuldig verzuim als tenlastelegging en het nieuwe hoofdstuk</w:t>
-      </w:r>
-      <w:r>
-        <w:t xml:space="preserve"> </w:t>
-      </w:r>
-      <w:r>
-        <w:t xml:space="preserve">“</w:t>
-      </w:r>
-      <w:r>
-        <w:t xml:space="preserve">Twee meter</w:t>
-      </w:r>
-      <w:r>
-        <w:t xml:space="preserve">”</w:t>
-      </w:r>
-      <w:r>
-        <w:t xml:space="preserve">.</w:t>
+        <w:t xml:space="preserve">Laatste update: 12 oktober 2026. Manuscript v6: verhaallijncontrole van het hele boek doorgevoerd (tijdlijn, symboliek, Isaaks loopbaan, Arnolds terugkeer).</w:t>
       </w:r>
     </w:p>
     <w:bookmarkEnd w:id="20"/>
@@ -1067,7 +1052,7 @@
               <w:jc w:val="left"/>
             </w:pPr>
             <w:r>
-              <w:t xml:space="preserve">48. Zat 25 jaar bij de politie, 12 jaar bij de recherche. Was twaalf jaar geleden net rechercheur in Maastricht, werkte één dag aan het dossier, werd daarna naar Amsterdam overgeplaatst en nam een kopie van zijn aantekeningen mee (daarom ligt het in Amsterdam). Heeft Marieke nooit teruggebeld.</w:t>
+              <w:t xml:space="preserve">48. 25 jaar bij de politie: 13 jaar in uniform in Maastricht, daarna rechercheur. Werkte twaalf jaar geleden als kersverse rechercheur één dag aan het dossier en vertrok kort daarna naar Amsterdam. Het dossier ligt in Amsterdam omdat de Limburgse dozen bij een reorganisatie zijn meeverhuisd. Heeft Marieke nooit teruggebeld.</w:t>
             </w:r>
           </w:p>
         </w:tc>
@@ -2577,6 +2562,397 @@
       </w:r>
     </w:p>
     <w:bookmarkEnd w:id="31"/>
+    <w:bookmarkStart w:id="32" w:name="vastgestelde-tijdlijn-v6"/>
+    <w:p>
+      <w:pPr>
+        <w:pStyle w:val="Heading1"/>
+      </w:pPr>
+      <w:r>
+        <w:t xml:space="preserve">6. Vastgestelde tijdlijn (v6)</w:t>
+      </w:r>
+    </w:p>
+    <w:tbl>
+      <w:tblPr>
+        <w:tblStyle w:val="Table"/>
+        <w:tblW w:type="pct" w:w="5000"/>
+        <w:tblLook w:firstRow="1" w:lastRow="0" w:firstColumn="0" w:lastColumn="0" w:noHBand="0" w:noVBand="0" w:val="0020"/>
+        <w:jc w:val="start"/>
+      </w:tblPr>
+      <w:tblGrid>
+        <w:gridCol w:w="3960"/>
+        <w:gridCol w:w="3960"/>
+      </w:tblGrid>
+      <w:tr>
+        <w:trPr>
+          <w:tblHeader w:val="true"/>
+        </w:trPr>
+        <w:tc>
+          <w:tcPr/>
+          <w:p>
+            <w:pPr>
+              <w:pStyle w:val="Compact"/>
+              <w:jc w:val="left"/>
+            </w:pPr>
+            <w:r>
+              <w:t xml:space="preserve">Dag</w:t>
+            </w:r>
+          </w:p>
+        </w:tc>
+        <w:tc>
+          <w:tcPr/>
+          <w:p>
+            <w:pPr>
+              <w:pStyle w:val="Compact"/>
+              <w:jc w:val="left"/>
+            </w:pPr>
+            <w:r>
+              <w:t xml:space="preserve">Gebeurtenissen</w:t>
+            </w:r>
+          </w:p>
+        </w:tc>
+      </w:tr>
+      <w:tr>
+        <w:tc>
+          <w:tcPr/>
+          <w:p>
+            <w:pPr>
+              <w:pStyle w:val="Compact"/>
+              <w:jc w:val="left"/>
+            </w:pPr>
+            <w:r>
+              <w:t xml:space="preserve">Dag 1 (dinsdag)</w:t>
+            </w:r>
+          </w:p>
+        </w:tc>
+        <w:tc>
+          <w:tcPr/>
+          <w:p>
+            <w:pPr>
+              <w:pStyle w:val="Compact"/>
+              <w:jc w:val="left"/>
+            </w:pPr>
+            <w:r>
+              <w:t xml:space="preserve">06.30 Lars in het Stadsarchief (eigen pasje). Circa 07.45 Sophie in de studio, scan, telefoontje. Aanval in de studio. Woonboot, schuilkerk (Bram volgt hen), parkeergarage Waterlooplein. Middag: rit naar Den Haag. Isaak tot ’s middags in het archief, spreekt om circa 16.30 de voicemail in. Avond: Mauritshuis, cloud-sync, ontsnapping. Avond: terugbelactie bij Isaak thuis; hij rijdt naar Maastricht. Van Buren hoort van Terpstra; zender op Isaaks auto bij Eindhoven. Schemering: Lars, Sophie en Daan bij het hek, kokertje gevonden, Daan haalt hen na bijna drie uur op. 23.00 hotel. Kort voor middernacht: Isaak bij het hek, ziet het opengebroken slot, gaat niet naar binnen.</w:t>
+            </w:r>
+          </w:p>
+        </w:tc>
+      </w:tr>
+      <w:tr>
+        <w:tc>
+          <w:tcPr/>
+          <w:p>
+            <w:pPr>
+              <w:pStyle w:val="Compact"/>
+              <w:jc w:val="left"/>
+            </w:pPr>
+            <w:r>
+              <w:t xml:space="preserve">Dag 2</w:t>
+            </w:r>
+          </w:p>
+        </w:tc>
+        <w:tc>
+          <w:tcPr/>
+          <w:p>
+            <w:pPr>
+              <w:pStyle w:val="Compact"/>
+              <w:jc w:val="left"/>
+            </w:pPr>
+            <w:r>
+              <w:t xml:space="preserve">07.00 outdoorwinkel, mechanisme geopend. Circa 09.00 Isaak haalt het dossier op en vindt hen. 10.30 Voss belt Van Buren; circa 11.30 Van Buren in de berg. 11.00 Farah bij Beelen. Middag: terugtocht, sms van Beelen, één uur terug naar binnen (De opvolging). Namiddag: Farah en Bram bij het hek, instorting, zender gevonden, Isaaks auto blijft bij het hek. Avond: boerderij bij Epen. Schemering: Van der Heijden bij de instorting, stuurt het team. Avond/nacht: aanval, Piet geraakt, vlucht naar Duitsland. Dezelfde nacht graven twee mannen van Van Buren de instorting leeg en halen het manuscript.</w:t>
+            </w:r>
+          </w:p>
+        </w:tc>
+      </w:tr>
+      <w:tr>
+        <w:tc>
+          <w:tcPr/>
+          <w:p>
+            <w:pPr>
+              <w:pStyle w:val="Compact"/>
+              <w:jc w:val="left"/>
+            </w:pPr>
+            <w:r>
+              <w:t xml:space="preserve">Dag 3</w:t>
+            </w:r>
+          </w:p>
+        </w:tc>
+        <w:tc>
+          <w:tcPr/>
+          <w:p>
+            <w:pPr>
+              <w:pStyle w:val="Compact"/>
+              <w:jc w:val="left"/>
+            </w:pPr>
+            <w:r>
+              <w:t xml:space="preserve">Dageraad: schuur. Ochtend: pension Aken, telefoon met Frank. Van Burens tegenzet (aantekening in Isaaks dossier, opdracht om Arnold na te gaan). Middag: Aken, de kantlijnzin.</w:t>
+            </w:r>
+          </w:p>
+        </w:tc>
+      </w:tr>
+      <w:tr>
+        <w:tc>
+          <w:tcPr/>
+          <w:p>
+            <w:pPr>
+              <w:pStyle w:val="Compact"/>
+              <w:jc w:val="left"/>
+            </w:pPr>
+            <w:r>
+              <w:t xml:space="preserve">Dag 4</w:t>
+            </w:r>
+          </w:p>
+        </w:tc>
+        <w:tc>
+          <w:tcPr/>
+          <w:p>
+            <w:pPr>
+              <w:pStyle w:val="Compact"/>
+              <w:jc w:val="left"/>
+            </w:pPr>
+            <w:r>
+              <w:t xml:space="preserve">Ochtend: Sanders. Middag: terugkeer naar de tombe, schacht, lege nis. Sophie met de trein naar Den Haag; na 21.00 bij haar vader. 23.30 Sophie bij Sanders achter het Amstelstation. Middernacht: Van Buren met het manuscript.</w:t>
+            </w:r>
+          </w:p>
+        </w:tc>
+      </w:tr>
+      <w:tr>
+        <w:tc>
+          <w:tcPr/>
+          <w:p>
+            <w:pPr>
+              <w:pStyle w:val="Compact"/>
+              <w:jc w:val="left"/>
+            </w:pPr>
+            <w:r>
+              <w:t xml:space="preserve">Dag 5</w:t>
+            </w:r>
+          </w:p>
+        </w:tc>
+        <w:tc>
+          <w:tcPr/>
+          <w:p>
+            <w:pPr>
+              <w:pStyle w:val="Compact"/>
+              <w:jc w:val="left"/>
+            </w:pPr>
+            <w:r>
+              <w:t xml:space="preserve">04.00 Herengracht. Circa 06.00 Van der Heijden, aanhouding van Van Buren. 09.00 Arnolds verklaring (vier uur). Middag: ziekenhuis in Maastricht. Notaris.</w:t>
+            </w:r>
+          </w:p>
+        </w:tc>
+      </w:tr>
+      <w:tr>
+        <w:tc>
+          <w:tcPr/>
+          <w:p>
+            <w:pPr>
+              <w:pStyle w:val="Compact"/>
+              <w:jc w:val="left"/>
+            </w:pPr>
+            <w:r>
+              <w:t xml:space="preserve">Dag 10</w:t>
+            </w:r>
+          </w:p>
+        </w:tc>
+        <w:tc>
+          <w:tcPr/>
+          <w:p>
+            <w:pPr>
+              <w:pStyle w:val="Compact"/>
+              <w:jc w:val="left"/>
+            </w:pPr>
+            <w:r>
+              <w:t xml:space="preserve">Twee meter (woonboot, ’s avonds).</w:t>
+            </w:r>
+          </w:p>
+        </w:tc>
+      </w:tr>
+      <w:tr>
+        <w:tc>
+          <w:tcPr/>
+          <w:p>
+            <w:pPr>
+              <w:pStyle w:val="Compact"/>
+              <w:jc w:val="left"/>
+            </w:pPr>
+            <w:r>
+              <w:t xml:space="preserve">Dag 12 (zaterdag)</w:t>
+            </w:r>
+          </w:p>
+        </w:tc>
+        <w:tc>
+          <w:tcPr/>
+          <w:p>
+            <w:pPr>
+              <w:pStyle w:val="Compact"/>
+              <w:jc w:val="left"/>
+            </w:pPr>
+            <w:r>
+              <w:t xml:space="preserve">De nieuwe bewaarder.</w:t>
+            </w:r>
+          </w:p>
+        </w:tc>
+      </w:tr>
+      <w:tr>
+        <w:tc>
+          <w:tcPr/>
+          <w:p>
+            <w:pPr>
+              <w:pStyle w:val="Compact"/>
+              <w:jc w:val="left"/>
+            </w:pPr>
+            <w:r>
+              <w:t xml:space="preserve">Daarna</w:t>
+            </w:r>
+          </w:p>
+        </w:tc>
+        <w:tc>
+          <w:tcPr/>
+          <w:p>
+            <w:pPr>
+              <w:pStyle w:val="Compact"/>
+              <w:jc w:val="left"/>
+            </w:pPr>
+            <w:r>
+              <w:t xml:space="preserve">Wat onder de verf blijft, Afwikkeling (drie weken), Bezoek aan Lars’ moeder, Onthulling (circa twee maanden), Epiloog (een jaar later).</w:t>
+            </w:r>
+          </w:p>
+        </w:tc>
+      </w:tr>
+    </w:tbl>
+    <w:bookmarkEnd w:id="32"/>
+    <w:bookmarkStart w:id="33" w:name="X123f3d282936f6854c84039373cd015f6d105fb"/>
+    <w:p>
+      <w:pPr>
+        <w:pStyle w:val="Heading1"/>
+      </w:pPr>
+      <w:r>
+        <w:t xml:space="preserve">7. Wie opende de deur, en wie schreef wat op de muur</w:t>
+      </w:r>
+    </w:p>
+    <w:p>
+      <w:pPr>
+        <w:numPr>
+          <w:ilvl w:val="0"/>
+          <w:numId w:val="1010"/>
+        </w:numPr>
+        <w:pStyle w:val="Compact"/>
+      </w:pPr>
+      <w:r>
+        <w:t xml:space="preserve">De muur met namen bevat bewaarders tot ergens tussen de twee wereldoorlogen; daarna ging de kennis van het mechanisme verloren.</w:t>
+      </w:r>
+    </w:p>
+    <w:p>
+      <w:pPr>
+        <w:numPr>
+          <w:ilvl w:val="0"/>
+          <w:numId w:val="1010"/>
+        </w:numPr>
+        <w:pStyle w:val="Compact"/>
+      </w:pPr>
+      <w:r>
+        <w:rPr>
+          <w:bCs/>
+          <w:b/>
+        </w:rPr>
+        <w:t xml:space="preserve">Arnold de Wit</w:t>
+      </w:r>
+      <w:r>
+        <w:t xml:space="preserve"> </w:t>
+      </w:r>
+      <w:r>
+        <w:t xml:space="preserve">ging drie jaar na Eriks dood terug, met Eriks kaart en drie jaar studie van diens aantekeningen. Hij knipte de sensordraad bij het hek door (de</w:t>
+      </w:r>
+      <w:r>
+        <w:t xml:space="preserve"> </w:t>
+      </w:r>
+      <w:r>
+        <w:t xml:space="preserve">“</w:t>
+      </w:r>
+      <w:r>
+        <w:t xml:space="preserve">onbevoegde toegang drie jaar na het incident</w:t>
+      </w:r>
+      <w:r>
+        <w:t xml:space="preserve">”</w:t>
+      </w:r>
+      <w:r>
+        <w:t xml:space="preserve"> </w:t>
+      </w:r>
+      <w:r>
+        <w:t xml:space="preserve">in het dossier van de mijnbouwautoriteit), opende de deur, zette Eriks naam en formule in de stenen tafel, en sloot alles weer. Van Buren weet dit niet.</w:t>
+      </w:r>
+    </w:p>
+    <w:p>
+      <w:pPr>
+        <w:numPr>
+          <w:ilvl w:val="0"/>
+          <w:numId w:val="1010"/>
+        </w:numPr>
+        <w:pStyle w:val="Compact"/>
+      </w:pPr>
+      <w:r>
+        <w:t xml:space="preserve">Lars en Sophie openen de deur opnieuw op dag 2. Van Burens mannen gebruiken die open deur in de nacht van dag 2.</w:t>
+      </w:r>
+    </w:p>
+    <w:p>
+      <w:pPr>
+        <w:numPr>
+          <w:ilvl w:val="0"/>
+          <w:numId w:val="1010"/>
+        </w:numPr>
+        <w:pStyle w:val="Compact"/>
+      </w:pPr>
+      <w:r>
+        <w:t xml:space="preserve">Het papieren register van de loge (achter in het manuscript) is iets anders dan de muur: daarin staan Van Buren en Arnold.</w:t>
+      </w:r>
+    </w:p>
+    <w:bookmarkEnd w:id="33"/>
+    <w:bookmarkStart w:id="34" w:name="symboliek"/>
+    <w:p>
+      <w:pPr>
+        <w:pStyle w:val="Heading1"/>
+      </w:pPr>
+      <w:r>
+        <w:t xml:space="preserve">8. Symboliek</w:t>
+      </w:r>
+    </w:p>
+    <w:p>
+      <w:pPr>
+        <w:numPr>
+          <w:ilvl w:val="0"/>
+          <w:numId w:val="1011"/>
+        </w:numPr>
+        <w:pStyle w:val="Compact"/>
+      </w:pPr>
+      <w:r>
+        <w:t xml:space="preserve">Bouwmeesters: passer zonder winkelhaak, cirkel met middelpunt, acht punten, vijf lijnen volgens de Gulden Snede.</w:t>
+      </w:r>
+    </w:p>
+    <w:p>
+      <w:pPr>
+        <w:numPr>
+          <w:ilvl w:val="0"/>
+          <w:numId w:val="1011"/>
+        </w:numPr>
+        <w:pStyle w:val="Compact"/>
+      </w:pPr>
+      <w:r>
+        <w:t xml:space="preserve">Sophies ring: passer in een cirkel, zonder winkelhaak. Haar vader droeg hem nooit.</w:t>
+      </w:r>
+    </w:p>
+    <w:p>
+      <w:pPr>
+        <w:numPr>
+          <w:ilvl w:val="0"/>
+          <w:numId w:val="1011"/>
+        </w:numPr>
+        <w:pStyle w:val="Compact"/>
+      </w:pPr>
+      <w:r>
+        <w:t xml:space="preserve">Het Nieuwe Licht: leider ter plaatse bij de studio was Bram; Van der Heijden wachtte in de loods.</w:t>
+      </w:r>
+    </w:p>
+    <w:bookmarkEnd w:id="34"/>
     <w:sectPr/>
   </w:body>
 </w:document>
@@ -2953,6 +3329,12 @@
     </w:lvlOverride>
   </w:num>
   <w:num w:numId="1009">
+    <w:abstractNumId w:val="991"/>
+  </w:num>
+  <w:num w:numId="1010">
+    <w:abstractNumId w:val="991"/>
+  </w:num>
+  <w:num w:numId="1011">
     <w:abstractNumId w:val="991"/>
   </w:num>
 </w:numbering>

</xml_diff>

<commit_message>
Arnold verklaart waarom hij het manuscript niet zag
Co-Authored-By: Claude Opus 5.5 <noreply@anthropic.com>
Claude-Session: https://claude.ai/code/session_01NePC8cCoeqbRjNexdJRDxm
</commit_message>
<xml_diff>
--- a/story-bible/Story_Bible_De_Schaduw_van_de_Nachtwacht.docx
+++ b/story-bible/Story_Bible_De_Schaduw_van_de_Nachtwacht.docx
@@ -2879,7 +2879,19 @@
         <w:t xml:space="preserve"> </w:t>
       </w:r>
       <w:r>
-        <w:t xml:space="preserve">in het dossier van de mijnbouwautoriteit), opende de deur, zette Eriks naam en formule in de stenen tafel, en sloot alles weer. Van Buren weet dit niet.</w:t>
+        <w:t xml:space="preserve">in het dossier van de mijnbouwautoriteit), opende de deur, zette Eriks naam en formule in de stenen tafel, en sloot alles weer. Hij keek niet verder en zag de nis met het manuscript dus niet (</w:t>
+      </w:r>
+      <w:r>
+        <w:t xml:space="preserve">“</w:t>
+      </w:r>
+      <w:r>
+        <w:t xml:space="preserve">Ik kwam niet voor wat daar lag</w:t>
+      </w:r>
+      <w:r>
+        <w:t xml:space="preserve">”</w:t>
+      </w:r>
+      <w:r>
+        <w:t xml:space="preserve">). Van Buren weet dit niet.</w:t>
       </w:r>
     </w:p>
     <w:p>

</xml_diff>

<commit_message>
Manuscript v8: stijlronde, nieuw slot, nawoord en publicatiebestanden
Zinnen ingekort en herhaalde formules uitgedund in het hele boek,
afwikkeling samengevoegd, dialogen aan het eind menselijker, plekken
zintuiglijker, Eregalerij gecorrigeerd, nawoord toegevoegd, tweede
correctorsronde. Proef-PDF (KDP 6x9) en EPUB toegevoegd.

Co-Authored-By: Claude Opus 5.5 <noreply@anthropic.com>
Claude-Session: https://claude.ai/code/session_01NePC8cCoeqbRjNexdJRDxm
</commit_message>
<xml_diff>
--- a/story-bible/Story_Bible_De_Schaduw_van_de_Nachtwacht.docx
+++ b/story-bible/Story_Bible_De_Schaduw_van_de_Nachtwacht.docx
@@ -87,7 +87,7 @@
         <w:pStyle w:val="BodyText"/>
       </w:pPr>
       <w:r>
-        <w:t xml:space="preserve">Laatste update: 12 oktober 2026. Manuscript v7: strenge correctorsronde (taal, spelling, kleine continuïteit) op basis van v6.1.</w:t>
+        <w:t xml:space="preserve">Laatste update: 12 oktober 2026. Manuscript v8: stijlronde, nieuw slot (afwikkeling samengevoegd), nawoord, tweede correctorsronde, publicatieklaar (KDP 6x9 en EPUB).</w:t>
       </w:r>
     </w:p>
     <w:bookmarkEnd w:id="20"/>
@@ -2658,7 +2658,7 @@
               <w:jc w:val="left"/>
             </w:pPr>
             <w:r>
-              <w:t xml:space="preserve">07.00 outdoorwinkel, mechanisme geopend. Circa 09.00 Isaak haalt het dossier op en vindt hen. 10.30 Voss belt Van Buren; circa 11.30 Van Buren in de berg. 11.00 Farah bij Beelen. Middag: terugtocht, sms van Beelen, één uur terug naar binnen (De opvolging). Namiddag: Farah en Bram bij het hek, instorting, zender gevonden, Isaaks auto blijft bij het hek. Avond: boerderij bij Epen. Schemering: Van der Heijden bij de instorting, stuurt het team. Avond/nacht: aanval, Piet geraakt, vlucht naar Duitsland. Dezelfde nacht graven twee mannen van Van Buren de instorting leeg en halen het manuscript.</w:t>
+              <w:t xml:space="preserve">07.00 outdoorwinkel, mechanisme geopend. Circa 09.00 Isaak haalt het dossier op en vindt hen. 10.30 Voss belt Van Buren; ruim twee uur later (circa 12.45) is Van Buren in de berg. 11.00 Farah bij Beelen. Middag: terugtocht, sms van Beelen, één uur terug naar binnen (De opvolging). Namiddag: Farah en Bram bij het hek, instorting, zender gevonden, Isaaks auto blijft bij het hek. Avond: boerderij bij Epen. Schemering: Van der Heijden bij de instorting, stuurt het team. Avond/nacht: aanval, Piet geraakt, vlucht naar Duitsland. Dezelfde nacht graven twee mannen van Van Buren de instorting leeg en halen het manuscript.</w:t>
             </w:r>
           </w:p>
         </w:tc>
@@ -2814,7 +2814,25 @@
               <w:jc w:val="left"/>
             </w:pPr>
             <w:r>
-              <w:t xml:space="preserve">Wat onder de verf blijft, Afwikkeling (drie weken), Bezoek aan Lars’ moeder, Onthulling (circa twee maanden), Epiloog (een jaar later).</w:t>
+              <w:t xml:space="preserve">Wat onder de verf blijft (studio</w:t>
+            </w:r>
+            <w:r>
+              <w:t xml:space="preserve"> </w:t>
+            </w:r>
+            <w:r>
+              <w:t xml:space="preserve">‘</w:t>
+            </w:r>
+            <w:r>
+              <w:t xml:space="preserve">s ochtends, café aan de Amstel ’s middags; circa drie weken na dag 1), Bezoek aan Lars</w:t>
+            </w:r>
+            <w:r>
+              <w:t xml:space="preserve">’</w:t>
+            </w:r>
+            <w:r>
+              <w:t xml:space="preserve"> </w:t>
+            </w:r>
+            <w:r>
+              <w:t xml:space="preserve">moeder, De onthulling (circa twee maanden), Epiloog (een jaar later), Nawoord.</w:t>
             </w:r>
           </w:p>
         </w:tc>
@@ -2965,6 +2983,316 @@
       </w:r>
     </w:p>
     <w:bookmarkEnd w:id="34"/>
+    <w:bookmarkStart w:id="35" w:name="versie-8-stijlronde-en-publicatie"/>
+    <w:p>
+      <w:pPr>
+        <w:pStyle w:val="Heading1"/>
+      </w:pPr>
+      <w:r>
+        <w:t xml:space="preserve">9. Versie 8: stijlronde en publicatie</w:t>
+      </w:r>
+    </w:p>
+    <w:p>
+      <w:pPr>
+        <w:numPr>
+          <w:ilvl w:val="0"/>
+          <w:numId w:val="1012"/>
+        </w:numPr>
+        <w:pStyle w:val="Compact"/>
+      </w:pPr>
+      <w:r>
+        <w:rPr>
+          <w:bCs/>
+          <w:b/>
+        </w:rPr>
+        <w:t xml:space="preserve">Structuur slot:</w:t>
+      </w:r>
+      <w:r>
+        <w:t xml:space="preserve"> </w:t>
+      </w:r>
+      <w:r>
+        <w:t xml:space="preserve">“</w:t>
+      </w:r>
+      <w:r>
+        <w:t xml:space="preserve">Wat onder de verf blijft</w:t>
+      </w:r>
+      <w:r>
+        <w:t xml:space="preserve">”</w:t>
+      </w:r>
+      <w:r>
+        <w:t xml:space="preserve"> </w:t>
+      </w:r>
+      <w:r>
+        <w:t xml:space="preserve">en</w:t>
+      </w:r>
+      <w:r>
+        <w:t xml:space="preserve"> </w:t>
+      </w:r>
+      <w:r>
+        <w:t xml:space="preserve">“</w:t>
+      </w:r>
+      <w:r>
+        <w:t xml:space="preserve">Afwikkeling</w:t>
+      </w:r>
+      <w:r>
+        <w:t xml:space="preserve">”</w:t>
+      </w:r>
+      <w:r>
+        <w:t xml:space="preserve"> </w:t>
+      </w:r>
+      <w:r>
+        <w:t xml:space="preserve">zijn samengevoegd tot één hoofdstuk,</w:t>
+      </w:r>
+      <w:r>
+        <w:t xml:space="preserve"> </w:t>
+      </w:r>
+      <w:r>
+        <w:t xml:space="preserve">“</w:t>
+      </w:r>
+      <w:r>
+        <w:t xml:space="preserve">Wat onder de verf blijft</w:t>
+      </w:r>
+      <w:r>
+        <w:t xml:space="preserve">”</w:t>
+      </w:r>
+      <w:r>
+        <w:t xml:space="preserve">: eerst de studio, daarna het café aan de Amstel.</w:t>
+      </w:r>
+      <w:r>
+        <w:t xml:space="preserve"> </w:t>
+      </w:r>
+      <w:r>
+        <w:t xml:space="preserve">“</w:t>
+      </w:r>
+      <w:r>
+        <w:t xml:space="preserve">De onthulling in de Eregalerij</w:t>
+      </w:r>
+      <w:r>
+        <w:t xml:space="preserve">”</w:t>
+      </w:r>
+      <w:r>
+        <w:t xml:space="preserve"> </w:t>
+      </w:r>
+      <w:r>
+        <w:t xml:space="preserve">heet nu</w:t>
+      </w:r>
+      <w:r>
+        <w:t xml:space="preserve"> </w:t>
+      </w:r>
+      <w:r>
+        <w:t xml:space="preserve">“</w:t>
+      </w:r>
+      <w:r>
+        <w:t xml:space="preserve">De onthulling</w:t>
+      </w:r>
+      <w:r>
+        <w:t xml:space="preserve">”</w:t>
+      </w:r>
+      <w:r>
+        <w:t xml:space="preserve">. De plek is een kleine zijzaal naast de Nachtwachtzaal, zonder naam. De echte Eregalerij is de galerij die naar de Nachtwachtzaal leidt.</w:t>
+      </w:r>
+    </w:p>
+    <w:p>
+      <w:pPr>
+        <w:numPr>
+          <w:ilvl w:val="0"/>
+          <w:numId w:val="1012"/>
+        </w:numPr>
+        <w:pStyle w:val="Compact"/>
+      </w:pPr>
+      <w:r>
+        <w:rPr>
+          <w:bCs/>
+          <w:b/>
+        </w:rPr>
+        <w:t xml:space="preserve">Nawoord:</w:t>
+      </w:r>
+      <w:r>
+        <w:t xml:space="preserve"> </w:t>
+      </w:r>
+      <w:r>
+        <w:t xml:space="preserve">toegevoegd na de epiloog. Het zegt wat echt is (Rembrandt, Operatie Nachtwacht, de Sint-Pietersberg, het Mauritshuis, Ons’ Lieve Heer op Solder als inspiratie) en wat verzonnen is.</w:t>
+      </w:r>
+    </w:p>
+    <w:p>
+      <w:pPr>
+        <w:numPr>
+          <w:ilvl w:val="0"/>
+          <w:numId w:val="1012"/>
+        </w:numPr>
+        <w:pStyle w:val="Compact"/>
+      </w:pPr>
+      <w:r>
+        <w:rPr>
+          <w:bCs/>
+          <w:b/>
+        </w:rPr>
+        <w:t xml:space="preserve">Eriks naam:</w:t>
+      </w:r>
+      <w:r>
+        <w:t xml:space="preserve"> </w:t>
+      </w:r>
+      <w:r>
+        <w:t xml:space="preserve">staat in de stenen tafel in het midden van de kamer met de namen, niet op de muur. Lars kerft zijn naam daaronder.</w:t>
+      </w:r>
+    </w:p>
+    <w:p>
+      <w:pPr>
+        <w:numPr>
+          <w:ilvl w:val="0"/>
+          <w:numId w:val="1012"/>
+        </w:numPr>
+        <w:pStyle w:val="Compact"/>
+      </w:pPr>
+      <w:r>
+        <w:rPr>
+          <w:bCs/>
+          <w:b/>
+        </w:rPr>
+        <w:t xml:space="preserve">Isaak:</w:t>
+      </w:r>
+      <w:r>
+        <w:t xml:space="preserve"> </w:t>
+      </w:r>
+      <w:r>
+        <w:t xml:space="preserve">heeft nooit eerder verlof opgenomen zonder het een week vooruit te plannen; het oude</w:t>
+      </w:r>
+      <w:r>
+        <w:t xml:space="preserve"> </w:t>
+      </w:r>
+      <w:r>
+        <w:t xml:space="preserve">“</w:t>
+      </w:r>
+      <w:r>
+        <w:t xml:space="preserve">in vijf jaar</w:t>
+      </w:r>
+      <w:r>
+        <w:t xml:space="preserve">”</w:t>
+      </w:r>
+      <w:r>
+        <w:t xml:space="preserve"> </w:t>
+      </w:r>
+      <w:r>
+        <w:t xml:space="preserve">is weg.</w:t>
+      </w:r>
+    </w:p>
+    <w:p>
+      <w:pPr>
+        <w:numPr>
+          <w:ilvl w:val="0"/>
+          <w:numId w:val="1012"/>
+        </w:numPr>
+        <w:pStyle w:val="Compact"/>
+      </w:pPr>
+      <w:r>
+        <w:rPr>
+          <w:bCs/>
+          <w:b/>
+        </w:rPr>
+        <w:t xml:space="preserve">Daan:</w:t>
+      </w:r>
+      <w:r>
+        <w:t xml:space="preserve"> </w:t>
+      </w:r>
+      <w:r>
+        <w:t xml:space="preserve">zijn oude scriptieonderwerp was waterschappen in de zeventiende eeuw.</w:t>
+      </w:r>
+    </w:p>
+    <w:p>
+      <w:pPr>
+        <w:numPr>
+          <w:ilvl w:val="0"/>
+          <w:numId w:val="1012"/>
+        </w:numPr>
+        <w:pStyle w:val="Compact"/>
+      </w:pPr>
+      <w:r>
+        <w:rPr>
+          <w:bCs/>
+          <w:b/>
+        </w:rPr>
+        <w:t xml:space="preserve">Stijlregels die nu gelden:</w:t>
+      </w:r>
+    </w:p>
+    <w:p>
+      <w:pPr>
+        <w:numPr>
+          <w:ilvl w:val="1"/>
+          <w:numId w:val="1013"/>
+        </w:numPr>
+        <w:pStyle w:val="Compact"/>
+      </w:pPr>
+      <w:r>
+        <w:t xml:space="preserve">zinnen in actie kort;</w:t>
+      </w:r>
+    </w:p>
+    <w:p>
+      <w:pPr>
+        <w:numPr>
+          <w:ilvl w:val="1"/>
+          <w:numId w:val="1013"/>
+        </w:numPr>
+        <w:pStyle w:val="Compact"/>
+      </w:pPr>
+      <w:r>
+        <w:t xml:space="preserve">geen gedachtestreepjes;</w:t>
+      </w:r>
+    </w:p>
+    <w:p>
+      <w:pPr>
+        <w:numPr>
+          <w:ilvl w:val="1"/>
+          <w:numId w:val="1013"/>
+        </w:numPr>
+        <w:pStyle w:val="Compact"/>
+      </w:pPr>
+      <w:r>
+        <w:t xml:space="preserve">“</w:t>
+      </w:r>
+      <w:r>
+        <w:t xml:space="preserve">voor het eerst</w:t>
+      </w:r>
+      <w:r>
+        <w:t xml:space="preserve">”</w:t>
+      </w:r>
+      <w:r>
+        <w:t xml:space="preserve"> </w:t>
+      </w:r>
+      <w:r>
+        <w:t xml:space="preserve">en</w:t>
+      </w:r>
+      <w:r>
+        <w:t xml:space="preserve"> </w:t>
+      </w:r>
+      <w:r>
+        <w:t xml:space="preserve">“</w:t>
+      </w:r>
+      <w:r>
+        <w:t xml:space="preserve">alsof</w:t>
+      </w:r>
+      <w:r>
+        <w:t xml:space="preserve">”</w:t>
+      </w:r>
+      <w:r>
+        <w:t xml:space="preserve"> </w:t>
+      </w:r>
+      <w:r>
+        <w:t xml:space="preserve">spaarzaam (in het hele boek nu 12 en 22 keer);</w:t>
+      </w:r>
+    </w:p>
+    <w:p>
+      <w:pPr>
+        <w:numPr>
+          <w:ilvl w:val="1"/>
+          <w:numId w:val="1013"/>
+        </w:numPr>
+        <w:pStyle w:val="Compact"/>
+      </w:pPr>
+      <w:r>
+        <w:t xml:space="preserve">dialoog spreektalig.</w:t>
+      </w:r>
+    </w:p>
+    <w:bookmarkEnd w:id="35"/>
     <w:sectPr/>
   </w:body>
 </w:document>
@@ -3347,6 +3675,12 @@
     <w:abstractNumId w:val="991"/>
   </w:num>
   <w:num w:numId="1011">
+    <w:abstractNumId w:val="991"/>
+  </w:num>
+  <w:num w:numId="1012">
+    <w:abstractNumId w:val="991"/>
+  </w:num>
+  <w:num w:numId="1013">
     <w:abstractNumId w:val="991"/>
   </w:num>
 </w:numbering>

</xml_diff>